<commit_message>
Deploying to gh-pages from @ Morrison-Lab/mds@0e5f2bafe9ac2d4efe92d3e8fa0fc7287f96835e 🚀
</commit_message>
<xml_diff>
--- a/linear-algebra-projections.docx
+++ b/linear-algebra-projections.docx
@@ -15,7 +15,7 @@
         <w:pStyle w:val="Date"/>
       </w:pPr>
       <w:r>
-        <w:t xml:space="preserve">Last modified: 2026-10-15 04:45:51 (PDT)</w:t>
+        <w:t xml:space="preserve">Last modified: 2026-10-15 06:48:48 (PDT)</w:t>
       </w:r>
     </w:p>
     <w:bookmarkStart w:id="149" w:name="design-matrix"/>
@@ -11610,7 +11610,7 @@
           <w:rPr>
             <w:rStyle w:val="Hyperlink"/>
           </w:rPr>
-          <w:t xml:space="preserve">Corollary 2 in Inner Products and Orthogonality</w:t>
+          <w:t xml:space="preserve">Corollary 3 in Inner Products and Orthogonality</w:t>
         </w:r>
       </w:hyperlink>
       <w:r>

</xml_diff>

<commit_message>
Deploying to gh-pages from @ Morrison-Lab/mds@ec1c9db32fd6c44fd61cc4196ab2a3ce11a43f80 🚀
</commit_message>
<xml_diff>
--- a/linear-algebra-projections.docx
+++ b/linear-algebra-projections.docx
@@ -15,7 +15,7 @@
         <w:pStyle w:val="Date"/>
       </w:pPr>
       <w:r>
-        <w:t xml:space="preserve">Last modified: 2026-10-30 02:22:19 (PDT)</w:t>
+        <w:t xml:space="preserve">Last modified: 2026-10-30 12:07:09 (PDT)</w:t>
       </w:r>
     </w:p>
     <w:bookmarkStart w:id="181" w:name="design-matrix"/>
@@ -14799,7 +14799,7 @@
                 <w:rPr>
                   <w:rStyle w:val="Hyperlink"/>
                 </w:rPr>
-                <w:t xml:space="preserve">Theorem 16 in Column Space, Null Space and Rank-Nullity</w:t>
+                <w:t xml:space="preserve">Theorem 17 in Column Space, Null Space and Rank-Nullity</w:t>
               </w:r>
             </w:hyperlink>
             <w:r>
@@ -28146,7 +28146,7 @@
           <w:rPr>
             <w:rStyle w:val="Hyperlink"/>
           </w:rPr>
-          <w:t xml:space="preserve">Theorem 16 in Column Space, Null Space and Rank-Nullity</w:t>
+          <w:t xml:space="preserve">Theorem 17 in Column Space, Null Space and Rank-Nullity</w:t>
         </w:r>
       </w:hyperlink>
       <w:r>
@@ -32718,7 +32718,7 @@
           <w:rPr>
             <w:rStyle w:val="Hyperlink"/>
           </w:rPr>
-          <w:t xml:space="preserve">Example 26 in Column Space, Null Space and Rank-Nullity</w:t>
+          <w:t xml:space="preserve">Example 27 in Column Space, Null Space and Rank-Nullity</w:t>
         </w:r>
       </w:hyperlink>
       <w:r>

</xml_diff>